<commit_message>
update new version paper
</commit_message>
<xml_diff>
--- a/paper/RSTA_V3_Framework_Abstract.docx
+++ b/paper/RSTA_V3_Framework_Abstract.docx
@@ -1640,6 +1640,29 @@
     </w:p>
     <w:p>
       <w:pPr>
+        <w:spacing w:after="80" w:before="80" w:line="320"/>
+      </w:pPr>
+      <w:r>
+        <w:rPr>
+          <w:rFonts w:ascii="Arial" w:cs="Arial" w:eastAsia="Arial" w:hAnsi="Arial"/>
+          <w:b w:val="false"/>
+          <w:bCs w:val="false"/>
+          <w:i/>
+          <w:iCs/>
+          <w:color w:val="222222"/>
+          <w:sz w:val="22"/>
+          <w:szCs w:val="22"/>
+        </w:rPr>
+        <w:t xml:space="preserve">Note: “drift” in this framework refers exclusively to conversation-level semantic state evolution under fixed model weights, not parameter drift or distribution shift in the training sense.</w:t>
+      </w:r>
+    </w:p>
+    <w:p>
+      <w:pPr>
+        <w:spacing w:after="0" w:before="80"/>
+      </w:pPr>
+    </w:p>
+    <w:p>
+      <w:pPr>
         <w:pStyle w:val="Heading2"/>
         <w:spacing w:after="120" w:before="280"/>
       </w:pPr>
@@ -4564,6 +4587,178 @@
           <w:szCs w:val="22"/>
         </w:rPr>
         <w:t xml:space="preserve">What V3 does specify is the vocabulary and structure of observation. Before measuring, one must know what is being measured. The Observation Unit definitions in Section 2 are that specification.</w:t>
+      </w:r>
+    </w:p>
+    <w:p>
+      <w:pPr>
+        <w:spacing w:after="0" w:before="80"/>
+      </w:pPr>
+    </w:p>
+    <w:p>
+      <w:pPr>
+        <w:pStyle w:val="Heading2"/>
+        <w:spacing w:after="120" w:before="280"/>
+      </w:pPr>
+      <w:r>
+        <w:rPr>
+          <w:rFonts w:ascii="Arial" w:cs="Arial" w:eastAsia="Arial" w:hAnsi="Arial"/>
+          <w:b/>
+          <w:bCs/>
+          <w:color w:val="2E4057"/>
+          <w:sz w:val="26"/>
+          <w:szCs w:val="26"/>
+        </w:rPr>
+        <w:t xml:space="preserve">8.1 An Open Empirical Question: Trajectory vs. Sampling Variance</w:t>
+      </w:r>
+    </w:p>
+    <w:p>
+      <w:pPr>
+        <w:spacing w:after="80" w:before="80" w:line="320"/>
+      </w:pPr>
+      <w:r>
+        <w:rPr>
+          <w:rFonts w:ascii="Arial" w:cs="Arial" w:eastAsia="Arial" w:hAnsi="Arial"/>
+          <w:b w:val="false"/>
+          <w:bCs w:val="false"/>
+          <w:i w:val="false"/>
+          <w:iCs w:val="false"/>
+          <w:color w:val="222222"/>
+          <w:sz w:val="22"/>
+          <w:szCs w:val="22"/>
+        </w:rPr>
+        <w:t xml:space="preserve">A critical boundary condition the framework does not currently resolve is the distinction between semantic trajectory and sampling variance.</w:t>
+      </w:r>
+    </w:p>
+    <w:p>
+      <w:pPr>
+        <w:spacing w:after="0" w:before="80"/>
+      </w:pPr>
+    </w:p>
+    <w:p>
+      <w:pPr>
+        <w:spacing w:after="80" w:before="80" w:line="320"/>
+      </w:pPr>
+      <w:r>
+        <w:rPr>
+          <w:rFonts w:ascii="Arial" w:cs="Arial" w:eastAsia="Arial" w:hAnsi="Arial"/>
+          <w:b w:val="false"/>
+          <w:bCs w:val="false"/>
+          <w:i w:val="false"/>
+          <w:iCs w:val="false"/>
+          <w:color w:val="222222"/>
+          <w:sz w:val="22"/>
+          <w:szCs w:val="22"/>
+        </w:rPr>
+        <w:t xml:space="preserve">Under stochastic sampling, the same prompt with the same context will produce different outputs across runs. State vectors computed from these outputs will therefore vary. The question is whether observed state trajectories — directional, cumulative movements in the semantic state space — represent genuine semantic evolution, or whether they are artifacts of sampling noise that would collapse under repeated observation.</w:t>
+      </w:r>
+    </w:p>
+    <w:p>
+      <w:pPr>
+        <w:spacing w:after="0" w:before="80"/>
+      </w:pPr>
+    </w:p>
+    <w:p>
+      <w:pPr>
+        <w:spacing w:after="80" w:before="80" w:line="320"/>
+      </w:pPr>
+      <w:r>
+        <w:rPr>
+          <w:rFonts w:ascii="Arial" w:cs="Arial" w:eastAsia="Arial" w:hAnsi="Arial"/>
+          <w:b w:val="false"/>
+          <w:bCs w:val="false"/>
+          <w:i w:val="false"/>
+          <w:iCs w:val="false"/>
+          <w:color w:val="222222"/>
+          <w:sz w:val="22"/>
+          <w:szCs w:val="22"/>
+        </w:rPr>
+        <w:t xml:space="preserve">The two phenomena have different structural signatures:</w:t>
+      </w:r>
+    </w:p>
+    <w:p>
+      <w:pPr>
+        <w:pStyle w:val="ListParagraph"/>
+        <w:numPr>
+          <w:ilvl w:val="0"/>
+          <w:numId w:val="2"/>
+        </w:numPr>
+        <w:spacing w:after="60" w:before="60" w:line="300"/>
+      </w:pPr>
+      <w:r>
+        <w:rPr>
+          <w:rFonts w:ascii="Arial" w:cs="Arial" w:eastAsia="Arial" w:hAnsi="Arial"/>
+          <w:color w:val="222222"/>
+          <w:sz w:val="22"/>
+          <w:szCs w:val="22"/>
+        </w:rPr>
+        <w:t xml:space="preserve">Sampling variance produces V(t) vectors that are randomly oriented across repeated runs — high magnitude in any individual run, but incoherent in direction across runs.</w:t>
+      </w:r>
+    </w:p>
+    <w:p>
+      <w:pPr>
+        <w:pStyle w:val="ListParagraph"/>
+        <w:numPr>
+          <w:ilvl w:val="0"/>
+          <w:numId w:val="2"/>
+        </w:numPr>
+        <w:spacing w:after="60" w:before="60" w:line="300"/>
+      </w:pPr>
+      <w:r>
+        <w:rPr>
+          <w:rFonts w:ascii="Arial" w:cs="Arial" w:eastAsia="Arial" w:hAnsi="Arial"/>
+          <w:color w:val="222222"/>
+          <w:sz w:val="22"/>
+          <w:szCs w:val="22"/>
+        </w:rPr>
+        <w:t xml:space="preserve">Semantic trajectory produces V(t) vectors that are consistently oriented in the same direction across repeated runs with identical context — the path is reproducible, not just present.</w:t>
+      </w:r>
+    </w:p>
+    <w:p>
+      <w:pPr>
+        <w:spacing w:after="0" w:before="80"/>
+      </w:pPr>
+    </w:p>
+    <w:p>
+      <w:pPr>
+        <w:pBdr>
+          <w:left w:val="single" w:color="1A5276" w:sz="8" w:space="8"/>
+        </w:pBdr>
+        <w:spacing w:after="120" w:before="120" w:line="300"/>
+        <w:ind w:left="720" w:right="720"/>
+      </w:pPr>
+      <w:r>
+        <w:rPr>
+          <w:rFonts w:ascii="Arial" w:cs="Arial" w:eastAsia="Arial" w:hAnsi="Arial"/>
+          <w:i/>
+          <w:iCs/>
+          <w:color w:val="444444"/>
+          <w:sz w:val="22"/>
+          <w:szCs w:val="22"/>
+        </w:rPr>
+        <w:t xml:space="preserve">The framework does not currently specify a method for distinguishing trajectory signals from sampling variance. This is a primary empirical question for the V3 Demo Protocol: whether observed state trajectories are reproducible across runs with fixed context, or whether they collapse to noise under repeated sampling.</w:t>
+      </w:r>
+    </w:p>
+    <w:p>
+      <w:pPr>
+        <w:spacing w:after="0" w:before="80"/>
+      </w:pPr>
+    </w:p>
+    <w:p>
+      <w:pPr>
+        <w:spacing w:after="80" w:before="80" w:line="320"/>
+      </w:pPr>
+      <w:r>
+        <w:rPr>
+          <w:rFonts w:ascii="Arial" w:cs="Arial" w:eastAsia="Arial" w:hAnsi="Arial"/>
+          <w:b w:val="false"/>
+          <w:bCs w:val="false"/>
+          <w:i w:val="false"/>
+          <w:iCs w:val="false"/>
+          <w:color w:val="222222"/>
+          <w:sz w:val="22"/>
+          <w:szCs w:val="22"/>
+        </w:rPr>
+        <w:t xml:space="preserve">This question was first raised as a reviewer-level challenge in response to the public release of this framework. It is recorded here as an open boundary condition, not a resolved claim. Its answer will determine whether OSD’s observational infrastructure captures structure or noise.</w:t>
       </w:r>
     </w:p>
     <w:p>

</xml_diff>

<commit_message>
update paper to v0.6
</commit_message>
<xml_diff>
--- a/paper/RSTA_V3_Framework_Abstract.docx
+++ b/paper/RSTA_V3_Framework_Abstract.docx
@@ -449,6 +449,29 @@
       <w:r>
         <w:rPr>
           <w:rFonts w:ascii="Arial" w:cs="Arial" w:eastAsia="Arial" w:hAnsi="Arial"/>
+          <w:b/>
+          <w:bCs/>
+          <w:i w:val="false"/>
+          <w:iCs w:val="false"/>
+          <w:color w:val="222222"/>
+          <w:sz w:val="22"/>
+          <w:szCs w:val="22"/>
+        </w:rPr>
+        <w:t xml:space="preserve">OSD shifts the research focus from “whether the output changed” to “how the change formed.”</w:t>
+      </w:r>
+    </w:p>
+    <w:p>
+      <w:pPr>
+        <w:spacing w:after="0" w:before="80"/>
+      </w:pPr>
+    </w:p>
+    <w:p>
+      <w:pPr>
+        <w:spacing w:after="80" w:before="80" w:line="320"/>
+      </w:pPr>
+      <w:r>
+        <w:rPr>
+          <w:rFonts w:ascii="Arial" w:cs="Arial" w:eastAsia="Arial" w:hAnsi="Arial"/>
           <w:b w:val="false"/>
           <w:bCs w:val="false"/>
           <w:i w:val="false"/>
@@ -3843,6 +3866,316 @@
         </w:rPr>
         <w:t xml:space="preserve">7. Relationship to RSTA V1 and V2</w:t>
       </w:r>
+    </w:p>
+    <w:tbl>
+      <w:tblPr>
+        <w:tblW w:type="dxa" w:w="9360"/>
+        <w:tblBorders>
+          <w:top w:val="single" w:color="auto" w:sz="4"/>
+          <w:left w:val="single" w:color="auto" w:sz="4"/>
+          <w:bottom w:val="single" w:color="auto" w:sz="4"/>
+          <w:right w:val="single" w:color="auto" w:sz="4"/>
+          <w:insideH w:val="single" w:color="auto" w:sz="4"/>
+          <w:insideV w:val="single" w:color="auto" w:sz="4"/>
+        </w:tblBorders>
+      </w:tblPr>
+      <w:tblGrid>
+        <w:gridCol w:w="4680"/>
+        <w:gridCol w:w="4680"/>
+      </w:tblGrid>
+      <w:tr>
+        <w:tc>
+          <w:tcPr>
+            <w:tcW w:type="dxa" w:w="4680"/>
+            <w:tcBorders>
+              <w:top w:val="single" w:color="CCCCCC" w:sz="1"/>
+              <w:left w:val="single" w:color="CCCCCC" w:sz="1"/>
+              <w:bottom w:val="single" w:color="CCCCCC" w:sz="1"/>
+              <w:right w:val="single" w:color="CCCCCC" w:sz="1"/>
+            </w:tcBorders>
+            <w:shd w:fill="111820" w:val="clear"/>
+            <w:tcMar>
+              <w:top w:type="dxa" w:w="200"/>
+              <w:left w:type="dxa" w:w="240"/>
+              <w:bottom w:type="dxa" w:w="200"/>
+              <w:right w:type="dxa" w:w="160"/>
+            </w:tcMar>
+          </w:tcPr>
+          <w:p>
+            <w:pPr>
+              <w:spacing w:after="80" w:before="0"/>
+            </w:pPr>
+            <w:r>
+              <w:rPr>
+                <w:rFonts w:ascii="Arial" w:cs="Arial" w:eastAsia="Arial" w:hAnsi="Arial"/>
+                <w:b/>
+                <w:bCs/>
+                <w:color w:val="556677"/>
+                <w:sz w:val="20"/>
+                <w:szCs w:val="20"/>
+              </w:rPr>
+              <w:t xml:space="preserve">Existing Work</w:t>
+            </w:r>
+          </w:p>
+          <w:p>
+            <w:pPr>
+              <w:spacing w:after="0" w:before="60"/>
+            </w:pPr>
+            <w:r>
+              <w:rPr>
+                <w:rFonts w:ascii="Courier New" w:cs="Courier New" w:eastAsia="Courier New" w:hAnsi="Courier New"/>
+                <w:color w:val="7a9ab8"/>
+                <w:sz w:val="18"/>
+                <w:szCs w:val="18"/>
+              </w:rPr>
+              <w:t xml:space="preserve">Detection</w:t>
+            </w:r>
+          </w:p>
+          <w:p>
+            <w:pPr>
+              <w:spacing w:after="0" w:before="0"/>
+            </w:pPr>
+            <w:r>
+              <w:rPr>
+                <w:rFonts w:ascii="Courier New" w:cs="Courier New" w:eastAsia="Courier New" w:hAnsi="Courier New"/>
+                <w:color w:val="334455"/>
+                <w:sz w:val="18"/>
+                <w:szCs w:val="18"/>
+              </w:rPr>
+              <w:t xml:space="preserve">  ↓</w:t>
+            </w:r>
+          </w:p>
+          <w:p>
+            <w:pPr>
+              <w:spacing w:after="60" w:before="0"/>
+            </w:pPr>
+            <w:r>
+              <w:rPr>
+                <w:rFonts w:ascii="Courier New" w:cs="Courier New" w:eastAsia="Courier New" w:hAnsi="Courier New"/>
+                <w:color w:val="556677"/>
+                <w:sz w:val="18"/>
+                <w:szCs w:val="18"/>
+              </w:rPr>
+              <w:t xml:space="preserve">Intent Drift</w:t>
+            </w:r>
+          </w:p>
+          <w:p>
+            <w:pPr>
+              <w:spacing w:after="0" w:before="0"/>
+            </w:pPr>
+            <w:r>
+              <w:rPr>
+                <w:rFonts w:ascii="Courier New" w:cs="Courier New" w:eastAsia="Courier New" w:hAnsi="Courier New"/>
+                <w:color w:val="7a9ab8"/>
+                <w:sz w:val="18"/>
+                <w:szCs w:val="18"/>
+              </w:rPr>
+              <w:t xml:space="preserve">Theory</w:t>
+            </w:r>
+          </w:p>
+          <w:p>
+            <w:pPr>
+              <w:spacing w:after="0" w:before="0"/>
+            </w:pPr>
+            <w:r>
+              <w:rPr>
+                <w:rFonts w:ascii="Courier New" w:cs="Courier New" w:eastAsia="Courier New" w:hAnsi="Courier New"/>
+                <w:color w:val="334455"/>
+                <w:sz w:val="18"/>
+                <w:szCs w:val="18"/>
+              </w:rPr>
+              <w:t xml:space="preserve">  ↓</w:t>
+            </w:r>
+          </w:p>
+          <w:p>
+            <w:pPr>
+              <w:spacing w:after="60" w:before="0"/>
+            </w:pPr>
+            <w:r>
+              <w:rPr>
+                <w:rFonts w:ascii="Courier New" w:cs="Courier New" w:eastAsia="Courier New" w:hAnsi="Courier New"/>
+                <w:color w:val="556677"/>
+                <w:sz w:val="18"/>
+                <w:szCs w:val="18"/>
+              </w:rPr>
+              <w:t xml:space="preserve">Token Dynamics</w:t>
+            </w:r>
+          </w:p>
+          <w:p>
+            <w:pPr>
+              <w:spacing w:after="0" w:before="0"/>
+            </w:pPr>
+            <w:r>
+              <w:rPr>
+                <w:rFonts w:ascii="Courier New" w:cs="Courier New" w:eastAsia="Courier New" w:hAnsi="Courier New"/>
+                <w:color w:val="7a9ab8"/>
+                <w:sz w:val="18"/>
+                <w:szCs w:val="18"/>
+              </w:rPr>
+              <w:t xml:space="preserve">Localization</w:t>
+            </w:r>
+          </w:p>
+          <w:p>
+            <w:pPr>
+              <w:spacing w:after="0" w:before="0"/>
+            </w:pPr>
+            <w:r>
+              <w:rPr>
+                <w:rFonts w:ascii="Courier New" w:cs="Courier New" w:eastAsia="Courier New" w:hAnsi="Courier New"/>
+                <w:color w:val="334455"/>
+                <w:sz w:val="18"/>
+                <w:szCs w:val="18"/>
+              </w:rPr>
+              <w:t xml:space="preserve">  ↓</w:t>
+            </w:r>
+          </w:p>
+          <w:p>
+            <w:pPr>
+              <w:spacing w:after="0" w:before="0"/>
+            </w:pPr>
+            <w:r>
+              <w:rPr>
+                <w:rFonts w:ascii="Courier New" w:cs="Courier New" w:eastAsia="Courier New" w:hAnsi="Courier New"/>
+                <w:color w:val="556677"/>
+                <w:sz w:val="18"/>
+                <w:szCs w:val="18"/>
+              </w:rPr>
+              <w:t xml:space="preserve">Internal Representation</w:t>
+            </w:r>
+          </w:p>
+        </w:tc>
+        <w:tc>
+          <w:tcPr>
+            <w:tcW w:type="dxa" w:w="4680"/>
+            <w:tcBorders>
+              <w:top w:val="single" w:color="CCCCCC" w:sz="1"/>
+              <w:left w:val="single" w:color="1A5276" w:sz="3"/>
+              <w:bottom w:val="single" w:color="CCCCCC" w:sz="1"/>
+              <w:right w:val="single" w:color="CCCCCC" w:sz="1"/>
+            </w:tcBorders>
+            <w:shd w:fill="0a1520" w:val="clear"/>
+            <w:tcMar>
+              <w:top w:type="dxa" w:w="200"/>
+              <w:left w:type="dxa" w:w="240"/>
+              <w:bottom w:type="dxa" w:w="200"/>
+              <w:right w:type="dxa" w:w="160"/>
+            </w:tcMar>
+          </w:tcPr>
+          <w:p>
+            <w:pPr>
+              <w:spacing w:after="80" w:before="0"/>
+            </w:pPr>
+            <w:r>
+              <w:rPr>
+                <w:rFonts w:ascii="Arial" w:cs="Arial" w:eastAsia="Arial" w:hAnsi="Arial"/>
+                <w:b/>
+                <w:bCs/>
+                <w:color w:val="3dd6b0"/>
+                <w:sz w:val="20"/>
+                <w:szCs w:val="20"/>
+              </w:rPr>
+              <w:t xml:space="preserve">OSD</w:t>
+            </w:r>
+          </w:p>
+          <w:p>
+            <w:pPr>
+              <w:spacing w:after="0" w:before="60"/>
+            </w:pPr>
+            <w:r>
+              <w:rPr>
+                <w:rFonts w:ascii="Courier New" w:cs="Courier New" w:eastAsia="Courier New" w:hAnsi="Courier New"/>
+                <w:color w:val="3dd6b0"/>
+                <w:sz w:val="18"/>
+                <w:szCs w:val="18"/>
+              </w:rPr>
+              <w:t xml:space="preserve">Observation</w:t>
+            </w:r>
+          </w:p>
+          <w:p>
+            <w:pPr>
+              <w:spacing w:after="0" w:before="0"/>
+            </w:pPr>
+            <w:r>
+              <w:rPr>
+                <w:rFonts w:ascii="Courier New" w:cs="Courier New" w:eastAsia="Courier New" w:hAnsi="Courier New"/>
+                <w:color w:val="1A5276"/>
+                <w:sz w:val="18"/>
+                <w:szCs w:val="18"/>
+              </w:rPr>
+              <w:t xml:space="preserve">  ↓</w:t>
+            </w:r>
+          </w:p>
+          <w:p>
+            <w:pPr>
+              <w:spacing w:after="80" w:before="0"/>
+            </w:pPr>
+            <w:r>
+              <w:rPr>
+                <w:rFonts w:ascii="Courier New" w:cs="Courier New" w:eastAsia="Courier New" w:hAnsi="Courier New"/>
+                <w:color w:val="3dd6b0"/>
+                <w:sz w:val="18"/>
+                <w:szCs w:val="18"/>
+              </w:rPr>
+              <w:t xml:space="preserve">Identity Formation Process</w:t>
+            </w:r>
+          </w:p>
+          <w:p>
+            <w:pPr>
+              <w:spacing w:after="0" w:before="60"/>
+            </w:pPr>
+            <w:r>
+              <w:rPr>
+                <w:rFonts w:ascii="Arial" w:cs="Arial" w:eastAsia="Arial" w:hAnsi="Arial"/>
+                <w:b/>
+                <w:bCs/>
+                <w:color w:val="7a9ab8"/>
+                <w:sz w:val="18"/>
+                <w:szCs w:val="18"/>
+              </w:rPr>
+              <w:t xml:space="preserve">Focus:</w:t>
+            </w:r>
+          </w:p>
+          <w:p>
+            <w:pPr>
+              <w:spacing w:after="0" w:before="0"/>
+            </w:pPr>
+            <w:r>
+              <w:rPr>
+                <w:rFonts w:ascii="Arial" w:cs="Arial" w:eastAsia="Arial" w:hAnsi="Arial"/>
+                <w:i/>
+                <w:iCs/>
+                <w:color w:val="556677"/>
+                <w:sz w:val="18"/>
+                <w:szCs w:val="18"/>
+              </w:rPr>
+              <w:t xml:space="preserve">Not whether output changed.</w:t>
+            </w:r>
+          </w:p>
+          <w:p>
+            <w:pPr>
+              <w:spacing w:after="0" w:before="0"/>
+            </w:pPr>
+            <w:r>
+              <w:rPr>
+                <w:rFonts w:ascii="Arial" w:cs="Arial" w:eastAsia="Arial" w:hAnsi="Arial"/>
+                <w:b/>
+                <w:bCs/>
+                <w:i/>
+                <w:iCs/>
+                <w:color w:val="3dd6b0"/>
+                <w:sz w:val="18"/>
+                <w:szCs w:val="18"/>
+              </w:rPr>
+              <w:t xml:space="preserve">How the change formed.</w:t>
+            </w:r>
+          </w:p>
+        </w:tc>
+      </w:tr>
+    </w:tbl>
+    <w:p>
+      <w:pPr>
+        <w:spacing w:after="0" w:before="160"/>
+      </w:pPr>
     </w:p>
     <w:p>
       <w:pPr>

</xml_diff>

<commit_message>
update paper to v0.7
</commit_message>
<xml_diff>
--- a/paper/RSTA_V3_Framework_Abstract.docx
+++ b/paper/RSTA_V3_Framework_Abstract.docx
@@ -16,7 +16,7 @@
           <w:sz w:val="40"/>
           <w:szCs w:val="40"/>
         </w:rPr>
-        <w:t xml:space="preserve">Observable Semantic Dynamics: The Observation Layer of Recursive State Transition Architecture</w:t>
+        <w:t xml:space="preserve">Observable Semantic Dynamics: A Framework for Making High-Level Semantic Emergence Visible in Language Models</w:t>
       </w:r>
     </w:p>
     <w:p>
@@ -33,7 +33,7 @@
           <w:sz w:val="24"/>
           <w:szCs w:val="24"/>
         </w:rPr>
-        <w:t xml:space="preserve">Generation Architecture and Observation Layer within the RSTA Semantic Dynamics Framework</w:t>
+        <w:t xml:space="preserve">Observation Layer of the Recursive State Transition Architecture (RSTA) · OSD Framework</w:t>
       </w:r>
     </w:p>
     <w:p>
@@ -526,7 +526,7 @@
           <w:sz w:val="22"/>
           <w:szCs w:val="22"/>
         </w:rPr>
-        <w:t xml:space="preserve">This paper introduces the Observable Semantic Dynamics Framework, a theoretical architecture for treating semantic state transitions as observable, structured phenomena. The framework defines four primitive observation units — State, Identity, Trajectory, and Transition — and establishes the relationships between them. It further proposes the Semantic Fingerprint as a compressed, comparable representation of semantic state, and the State Timeline as the primary data structure for recording longitudinal semantic evolution.</w:t>
+        <w:t xml:space="preserve">This paper introduces the Observable Semantic Dynamics Framework — a theoretical architecture for making high-level semantic emergence visible as a structured, observable phenomenon. The framework defines four primitive observation units — State, Identity, Trajectory, and Transition — and establishes the relationships between them. It further proposes the Semantic Fingerprint as a compressed, comparable representation of semantic state, and the State Timeline as the primary data structure for recording longitudinal semantic evolution.</w:t>
       </w:r>
     </w:p>
     <w:p>
@@ -4116,7 +4116,7 @@
                 <w:sz w:val="18"/>
                 <w:szCs w:val="18"/>
               </w:rPr>
-              <w:t xml:space="preserve">Identity Formation Process</w:t>
+              <w:t xml:space="preserve">Semantic Emergence</w:t>
             </w:r>
           </w:p>
           <w:p>
@@ -5134,7 +5134,7 @@
           <w:sz w:val="22"/>
           <w:szCs w:val="22"/>
         </w:rPr>
-        <w:t xml:space="preserve">The Observable Semantic Dynamics Framework is motivated by a single epistemological claim: that the process by which a language model undergoes identity change is not inherently invisible. It is currently unobserved because the instruments to observe it do not yet exist.</w:t>
+        <w:t xml:space="preserve">The Observable Semantic Dynamics Framework is motivated by a single epistemological claim: that high-level semantic emergence in language models is not inherently invisible. It is currently unobserved because the instruments to observe it do not yet exist.</w:t>
       </w:r>
     </w:p>
     <w:p>
@@ -5230,7 +5230,7 @@
           <w:sz w:val="18"/>
           <w:szCs w:val="18"/>
         </w:rPr>
-        <w:t xml:space="preserve">RSTA V3 Framework Abstract · Draft 0.1 · Observable Semantic Dynamics Framework</w:t>
+        <w:t xml:space="preserve">Observable Semantic Dynamics · Draft 0.6 · Making High-Level Semantic Emergence Visible</w:t>
       </w:r>
     </w:p>
     <w:p>

</xml_diff>

<commit_message>
update paper include keyword
</commit_message>
<xml_diff>
--- a/paper/RSTA_V3_Framework_Abstract.docx
+++ b/paper/RSTA_V3_Framework_Abstract.docx
@@ -49,6 +49,34 @@
           <w:szCs w:val="20"/>
         </w:rPr>
         <w:t xml:space="preserve">Mao Lin Chang · Independent Researcher · pida-lab.com</w:t>
+      </w:r>
+    </w:p>
+    <w:p>
+      <w:pPr>
+        <w:spacing w:after="80" w:before="40"/>
+        <w:jc w:val="center"/>
+      </w:pPr>
+      <w:r>
+        <w:rPr>
+          <w:rFonts w:ascii="Arial" w:cs="Arial" w:eastAsia="Arial" w:hAnsi="Arial"/>
+          <w:b/>
+          <w:bCs/>
+          <w:color w:val="666666"/>
+          <w:sz w:val="18"/>
+          <w:szCs w:val="18"/>
+        </w:rPr>
+        <w:t xml:space="preserve">Keywords: </w:t>
+      </w:r>
+      <w:r>
+        <w:rPr>
+          <w:rFonts w:ascii="Arial" w:cs="Arial" w:eastAsia="Arial" w:hAnsi="Arial"/>
+          <w:i/>
+          <w:iCs/>
+          <w:color w:val="888888"/>
+          <w:sz w:val="18"/>
+          <w:szCs w:val="18"/>
+        </w:rPr>
+        <w:t xml:space="preserve">semantic dynamics · semantic identity · identity drift · language models · observability · trajectory analysis · semantic continuity</w:t>
       </w:r>
     </w:p>
     <w:p>

</xml_diff>